<commit_message>
feat: Add target-specific feature statistics to Table1 in phenotyping paper
- Calculate mean values for each feature by target (anxiety/depression/stress)
- Compare normal group (score<4) vs event group (score≥4)
- Restructure Table1 with separate columns for each target
- Add statistical analysis scripts and CSV outputs
- Update phenotyping paper with enhanced Table1

Co-Authored-By: bosoa <bosoagalaxy@gmail.com>
</commit_message>
<xml_diff>
--- a/draft_for_paper/phenotyping_paper_with_figures.docx
+++ b/draft_for_paper/phenotyping_paper_with_figures.docx
@@ -1041,19 +1041,27 @@
     </w:p>
     <w:p>
       <w:pPr>
+        <w:pStyle w:val="BodyText"/>
+      </w:pPr>
+      <w:r>
+        <w:t xml:space="preserve">각 특징변수는 타겟별로 이벤트군(score≥4)과 정상군(score&lt;4)에서 서로 다른 패턴을 보였다. 특히 걸음수(walk)는 모든 타겟에서 이벤트군이 정상군보다 낮았으며(불안: -3.3%, 우울: -2.2%, 스트레스: -4.8%), 심박변이도(hrv)도 모든 타겟에서 이벤트군이 낮았다(불안: -1.9%, 우울: -2.9%, 스트레스: -0.9%).</w:t>
+      </w:r>
+    </w:p>
+    <w:p>
+      <w:pPr>
         <w:pStyle w:val="CaptionedFigure"/>
       </w:pPr>
       <w:r>
         <w:drawing>
           <wp:inline>
-            <wp:extent cx="5334000" cy="4086841"/>
+            <wp:extent cx="5334000" cy="4022849"/>
             <wp:effectExtent b="0" l="0" r="0" t="0"/>
-            <wp:docPr descr="Table 1: 데이터셋의 기본 특성" title="" id="19" name="Picture"/>
+            <wp:docPr descr="Table 1: 데이터셋의 기본 특성 및 타겟별 통계" title="" id="19" name="Picture"/>
             <a:graphic>
               <a:graphicData uri="http://schemas.openxmlformats.org/drawingml/2006/picture">
                 <pic:pic>
                   <pic:nvPicPr>
-                    <pic:cNvPr descr="figures/phenotyping/table1_dataset_characteristics.png" id="20" name="Picture"/>
+                    <pic:cNvPr descr="figures/phenotyping/table1_dataset_characteristics_with_stats.png" id="20" name="Picture"/>
                     <pic:cNvPicPr>
                       <a:picLocks noChangeArrowheads="1" noChangeAspect="1"/>
                     </pic:cNvPicPr>
@@ -1067,7 +1075,7 @@
                   <pic:spPr bwMode="auto">
                     <a:xfrm>
                       <a:off x="0" y="0"/>
-                      <a:ext cx="5334000" cy="4086841"/>
+                      <a:ext cx="5334000" cy="4022849"/>
                     </a:xfrm>
                     <a:prstGeom prst="rect">
                       <a:avLst/>
@@ -1091,7 +1099,7 @@
         <w:pStyle w:val="ImageCaption"/>
       </w:pPr>
       <w:r>
-        <w:t xml:space="preserve">Table 1: 데이터셋의 기본 특성</w:t>
+        <w:t xml:space="preserve">Table 1: 데이터셋의 기본 특성 및 타겟별 통계</w:t>
       </w:r>
     </w:p>
     <w:p>
@@ -1103,13 +1111,13 @@
           <w:b/>
           <w:bCs/>
         </w:rPr>
-        <w:t xml:space="preserve">Table 1: 데이터셋의 기본 특성 (N=281,138).</w:t>
-      </w:r>
-      <w:r>
-        <w:t xml:space="preserve"> </w:t>
-      </w:r>
-      <w:r>
-        <w:t xml:space="preserve">KLOSDOM 전처리 데이터셋의 샘플 분포, 특징 변수, 데이터 전처리 방법을 요약. 세 가지 정신건강 타겟(Anxiety, Depression, Stress)에 대해 Train/Validation/Test 분할 및 이벤트 비율 제시. 이벤트는 셀프체크 점수 ≥ 4점으로 정의.</w:t>
+        <w:t xml:space="preserve">Table 1: 데이터셋의 기본 특성 및 타겟별 특징변수 통계 (N=281,138).</w:t>
+      </w:r>
+      <w:r>
+        <w:t xml:space="preserve"> </w:t>
+      </w:r>
+      <w:r>
+        <w:t xml:space="preserve">KLOSDOM 전처리 데이터셋의 샘플 분포, 특징 변수, 데이터 전처리 방법을 요약. 세 가지 정신건강 타겟(Anxiety, Depression, Stress)에 대해 Train/Validation/Test 분할 및 이벤트 비율 제시. 각 특징변수는 타겟별로 정상군(score&lt;4) 평균 → 이벤트군(score≥4) 평균 형식으로 표시. Anx=Anxiety, Dep=Depression, Str=Stress.</w:t>
       </w:r>
     </w:p>
     <w:bookmarkEnd w:id="21"/>

</xml_diff>